<commit_message>
Task 12 Report Done.
</commit_message>
<xml_diff>
--- a/12 - Spike - Command Pattern/Task 12 - Lab Spike Report.docx
+++ b/12 - Spike - Command Pattern/Task 12 - Lab Spike Report.docx
@@ -140,7 +140,25 @@
           <w:sz w:val="24"/>
           <w:szCs w:val="24"/>
         </w:rPr>
-        <w:t>The goal of this spike task is to demonstrate my ability to collect and analyse software performance data while applying my knowledge in comparing and evaluating functions, IDE and complier settings.</w:t>
+        <w:t xml:space="preserve">The goal of this spike task is to demonstrate my ability to collect and analyse software performance data while applying my knowledge in comparing and evaluating functions, </w:t>
+      </w:r>
+      <w:proofErr w:type="gramStart"/>
+      <w:r>
+        <w:rPr>
+          <w:rStyle w:val="SubtleReference"/>
+          <w:sz w:val="24"/>
+          <w:szCs w:val="24"/>
+        </w:rPr>
+        <w:t>IDE</w:t>
+      </w:r>
+      <w:proofErr w:type="gramEnd"/>
+      <w:r>
+        <w:rPr>
+          <w:rStyle w:val="SubtleReference"/>
+          <w:sz w:val="24"/>
+          <w:szCs w:val="24"/>
+        </w:rPr>
+        <w:t xml:space="preserve"> and complier settings.</w:t>
       </w:r>
     </w:p>
     <w:p>
@@ -247,18 +265,48 @@
           <w:sz w:val="24"/>
           <w:szCs w:val="24"/>
         </w:rPr>
-        <w:t xml:space="preserve"> - Spike - </w:t>
-      </w:r>
-      <w:proofErr w:type="spellStart"/>
-      <w:r>
-        <w:rPr>
-          <w:rStyle w:val="SubtleReference"/>
-          <w:sz w:val="24"/>
-          <w:szCs w:val="24"/>
-        </w:rPr>
-        <w:t>CommandPattern</w:t>
-      </w:r>
-      <w:proofErr w:type="spellEnd"/>
+        <w:t xml:space="preserve"> - Spike </w:t>
+      </w:r>
+      <w:r>
+        <w:rPr>
+          <w:rStyle w:val="SubtleReference"/>
+          <w:sz w:val="24"/>
+          <w:szCs w:val="24"/>
+        </w:rPr>
+        <w:t>–</w:t>
+      </w:r>
+      <w:r>
+        <w:rPr>
+          <w:rStyle w:val="SubtleReference"/>
+          <w:sz w:val="24"/>
+          <w:szCs w:val="24"/>
+        </w:rPr>
+        <w:t xml:space="preserve"> </w:t>
+      </w:r>
+      <w:r>
+        <w:rPr>
+          <w:rStyle w:val="SubtleReference"/>
+          <w:sz w:val="24"/>
+          <w:szCs w:val="24"/>
+        </w:rPr>
+        <w:t>Command</w:t>
+      </w:r>
+      <w:r>
+        <w:rPr>
+          <w:rStyle w:val="SubtleReference"/>
+          <w:sz w:val="24"/>
+          <w:szCs w:val="24"/>
+        </w:rPr>
+        <w:t xml:space="preserve"> </w:t>
+      </w:r>
+      <w:r>
+        <w:rPr>
+          <w:rStyle w:val="SubtleReference"/>
+          <w:sz w:val="24"/>
+          <w:szCs w:val="24"/>
+        </w:rPr>
+        <w:t>Pattern</w:t>
+      </w:r>
       <w:r>
         <w:rPr>
           <w:rStyle w:val="SubtleReference"/>
@@ -723,8 +771,8 @@
       </w:pPr>
       <w:r>
         <w:drawing>
-          <wp:inline distT="0" distB="0" distL="0" distR="0" wp14:anchorId="4298ACA1" wp14:editId="40117A19">
-            <wp:extent cx="6116320" cy="3641090"/>
+          <wp:inline distT="0" distB="0" distL="0" distR="0" wp14:anchorId="4298ACA1" wp14:editId="4EDF2F9F">
+            <wp:extent cx="5410200" cy="3220732"/>
             <wp:effectExtent l="0" t="0" r="0" b="0"/>
             <wp:docPr id="210240005" name="Picture 1"/>
             <wp:cNvGraphicFramePr>
@@ -746,7 +794,7 @@
                   <pic:spPr>
                     <a:xfrm>
                       <a:off x="0" y="0"/>
-                      <a:ext cx="6116320" cy="3641090"/>
+                      <a:ext cx="5416561" cy="3224519"/>
                     </a:xfrm>
                     <a:prstGeom prst="rect">
                       <a:avLst/>
@@ -766,14 +814,27 @@
       <w:r>
         <w:t xml:space="preserve">Figure </w:t>
       </w:r>
-      <w:fldSimple w:instr=" SEQ Figure \* ARABIC ">
-        <w:r>
-          <w:rPr>
-            <w:noProof/>
-          </w:rPr>
-          <w:t>1</w:t>
-        </w:r>
-      </w:fldSimple>
+      <w:r>
+        <w:fldChar w:fldCharType="begin"/>
+      </w:r>
+      <w:r>
+        <w:instrText xml:space="preserve"> SEQ Figure \* ARABIC </w:instrText>
+      </w:r>
+      <w:r>
+        <w:fldChar w:fldCharType="separate"/>
+      </w:r>
+      <w:r>
+        <w:rPr>
+          <w:noProof/>
+        </w:rPr>
+        <w:t>1</w:t>
+      </w:r>
+      <w:r>
+        <w:rPr>
+          <w:noProof/>
+        </w:rPr>
+        <w:fldChar w:fldCharType="end"/>
+      </w:r>
       <w:r>
         <w:t xml:space="preserve"> : </w:t>
       </w:r>
@@ -810,15 +871,934 @@
           <w:szCs w:val="28"/>
         </w:rPr>
       </w:pPr>
-    </w:p>
-    <w:p>
-      <w:pPr>
-        <w:spacing w:line="360" w:lineRule="auto"/>
-        <w:jc w:val="both"/>
-      </w:pPr>
+      <w:r>
+        <w:rPr>
+          <w:b/>
+          <w:noProof/>
+          <w:color w:val="767171" w:themeColor="background2" w:themeShade="80"/>
+          <w:sz w:val="28"/>
+          <w:szCs w:val="28"/>
+        </w:rPr>
+        <w:drawing>
+          <wp:anchor distT="0" distB="0" distL="114300" distR="114300" simplePos="0" relativeHeight="251658240" behindDoc="0" locked="0" layoutInCell="1" allowOverlap="1" wp14:anchorId="3F310206" wp14:editId="695847D8">
+            <wp:simplePos x="0" y="0"/>
+            <wp:positionH relativeFrom="column">
+              <wp:posOffset>41910</wp:posOffset>
+            </wp:positionH>
+            <wp:positionV relativeFrom="paragraph">
+              <wp:posOffset>308610</wp:posOffset>
+            </wp:positionV>
+            <wp:extent cx="2591435" cy="2773680"/>
+            <wp:effectExtent l="0" t="0" r="0" b="7620"/>
+            <wp:wrapSquare wrapText="bothSides"/>
+            <wp:docPr id="110272363" name="Picture 2" descr="A screen shot of a computer program&#10;&#10;Description automatically generated"/>
+            <wp:cNvGraphicFramePr>
+              <a:graphicFrameLocks xmlns:a="http://schemas.openxmlformats.org/drawingml/2006/main" noChangeAspect="1"/>
+            </wp:cNvGraphicFramePr>
+            <a:graphic xmlns:a="http://schemas.openxmlformats.org/drawingml/2006/main">
+              <a:graphicData uri="http://schemas.openxmlformats.org/drawingml/2006/picture">
+                <pic:pic xmlns:pic="http://schemas.openxmlformats.org/drawingml/2006/picture">
+                  <pic:nvPicPr>
+                    <pic:cNvPr id="110272363" name="Picture 2" descr="A screen shot of a computer program&#10;&#10;Description automatically generated"/>
+                    <pic:cNvPicPr>
+                      <a:picLocks noChangeAspect="1" noChangeArrowheads="1"/>
+                    </pic:cNvPicPr>
+                  </pic:nvPicPr>
+                  <pic:blipFill rotWithShape="1">
+                    <a:blip r:embed="rId8">
+                      <a:extLst>
+                        <a:ext uri="{28A0092B-C50C-407E-A947-70E740481C1C}">
+                          <a14:useLocalDpi xmlns:a14="http://schemas.microsoft.com/office/drawing/2010/main" val="0"/>
+                        </a:ext>
+                      </a:extLst>
+                    </a:blip>
+                    <a:srcRect l="11471" t="8781" r="7730" b="29074"/>
+                    <a:stretch/>
+                  </pic:blipFill>
+                  <pic:spPr bwMode="auto">
+                    <a:xfrm>
+                      <a:off x="0" y="0"/>
+                      <a:ext cx="2591435" cy="2773680"/>
+                    </a:xfrm>
+                    <a:prstGeom prst="rect">
+                      <a:avLst/>
+                    </a:prstGeom>
+                    <a:noFill/>
+                    <a:ln>
+                      <a:noFill/>
+                    </a:ln>
+                    <a:extLst>
+                      <a:ext uri="{53640926-AAD7-44D8-BBD7-CCE9431645EC}">
+                        <a14:shadowObscured xmlns:a14="http://schemas.microsoft.com/office/drawing/2010/main"/>
+                      </a:ext>
+                    </a:extLst>
+                  </pic:spPr>
+                </pic:pic>
+              </a:graphicData>
+            </a:graphic>
+            <wp14:sizeRelH relativeFrom="margin">
+              <wp14:pctWidth>0</wp14:pctWidth>
+            </wp14:sizeRelH>
+            <wp14:sizeRelV relativeFrom="margin">
+              <wp14:pctHeight>0</wp14:pctHeight>
+            </wp14:sizeRelV>
+          </wp:anchor>
+        </w:drawing>
+      </w:r>
+      <w:r>
+        <w:rPr>
+          <w:b/>
+          <w:color w:val="767171" w:themeColor="background2" w:themeShade="80"/>
+          <w:sz w:val="28"/>
+          <w:szCs w:val="28"/>
+        </w:rPr>
+        <w:t xml:space="preserve">Implementing </w:t>
+      </w:r>
+      <w:proofErr w:type="spellStart"/>
+      <w:r>
+        <w:rPr>
+          <w:b/>
+          <w:color w:val="767171" w:themeColor="background2" w:themeShade="80"/>
+          <w:sz w:val="28"/>
+          <w:szCs w:val="28"/>
+        </w:rPr>
+        <w:t>GameWorld</w:t>
+      </w:r>
+      <w:proofErr w:type="spellEnd"/>
+      <w:r>
+        <w:rPr>
+          <w:b/>
+          <w:color w:val="767171" w:themeColor="background2" w:themeShade="80"/>
+          <w:sz w:val="28"/>
+          <w:szCs w:val="28"/>
+        </w:rPr>
+        <w:t>:</w:t>
+      </w:r>
+    </w:p>
+    <w:p>
+      <w:pPr>
+        <w:spacing w:line="360" w:lineRule="auto"/>
+        <w:jc w:val="both"/>
+        <w:rPr>
+          <w:b/>
+          <w:noProof/>
+          <w:color w:val="000000" w:themeColor="text1"/>
+          <w:sz w:val="24"/>
+        </w:rPr>
+      </w:pPr>
+      <w:r>
+        <w:rPr>
+          <w:b/>
+          <w:noProof/>
+          <w:color w:val="000000" w:themeColor="text1"/>
+          <w:sz w:val="24"/>
+        </w:rPr>
+        <w:t>We modified SelectAdventure to be able to read from our .JSON file that consists of data regarding our locations with connections and items stored in them.</w:t>
+      </w:r>
+    </w:p>
+    <w:p>
+      <w:pPr>
+        <w:spacing w:line="360" w:lineRule="auto"/>
+        <w:jc w:val="both"/>
+        <w:rPr>
+          <w:b/>
+          <w:noProof/>
+          <w:color w:val="000000" w:themeColor="text1"/>
+          <w:sz w:val="24"/>
+        </w:rPr>
+      </w:pPr>
+    </w:p>
+    <w:p>
+      <w:pPr>
+        <w:spacing w:line="360" w:lineRule="auto"/>
+        <w:jc w:val="both"/>
+        <w:rPr>
+          <w:b/>
+          <w:noProof/>
+          <w:color w:val="767171" w:themeColor="background2" w:themeShade="80"/>
+          <w:sz w:val="28"/>
+          <w:szCs w:val="28"/>
+        </w:rPr>
+      </w:pPr>
+      <w:r>
+        <w:rPr>
+          <w:b/>
+          <w:noProof/>
+          <w:color w:val="767171" w:themeColor="background2" w:themeShade="80"/>
+          <w:sz w:val="28"/>
+          <w:szCs w:val="28"/>
+        </w:rPr>
+        <w:lastRenderedPageBreak/>
+        <w:drawing>
+          <wp:anchor distT="0" distB="0" distL="114300" distR="114300" simplePos="0" relativeHeight="251659264" behindDoc="0" locked="0" layoutInCell="1" allowOverlap="1" wp14:anchorId="51C623EA" wp14:editId="694FAA9B">
+            <wp:simplePos x="0" y="0"/>
+            <wp:positionH relativeFrom="column">
+              <wp:posOffset>-3810</wp:posOffset>
+            </wp:positionH>
+            <wp:positionV relativeFrom="paragraph">
+              <wp:posOffset>0</wp:posOffset>
+            </wp:positionV>
+            <wp:extent cx="2773680" cy="8260080"/>
+            <wp:effectExtent l="0" t="0" r="7620" b="7620"/>
+            <wp:wrapThrough wrapText="bothSides">
+              <wp:wrapPolygon edited="0">
+                <wp:start x="0" y="0"/>
+                <wp:lineTo x="0" y="21570"/>
+                <wp:lineTo x="21511" y="21570"/>
+                <wp:lineTo x="21511" y="0"/>
+                <wp:lineTo x="0" y="0"/>
+              </wp:wrapPolygon>
+            </wp:wrapThrough>
+            <wp:docPr id="1733090070" name="Picture 1"/>
+            <wp:cNvGraphicFramePr>
+              <a:graphicFrameLocks xmlns:a="http://schemas.openxmlformats.org/drawingml/2006/main" noChangeAspect="1"/>
+            </wp:cNvGraphicFramePr>
+            <a:graphic xmlns:a="http://schemas.openxmlformats.org/drawingml/2006/main">
+              <a:graphicData uri="http://schemas.openxmlformats.org/drawingml/2006/picture">
+                <pic:pic xmlns:pic="http://schemas.openxmlformats.org/drawingml/2006/picture">
+                  <pic:nvPicPr>
+                    <pic:cNvPr id="0" name="Picture 1"/>
+                    <pic:cNvPicPr>
+                      <a:picLocks noChangeAspect="1" noChangeArrowheads="1"/>
+                    </pic:cNvPicPr>
+                  </pic:nvPicPr>
+                  <pic:blipFill rotWithShape="1">
+                    <a:blip r:embed="rId9">
+                      <a:extLst>
+                        <a:ext uri="{28A0092B-C50C-407E-A947-70E740481C1C}">
+                          <a14:useLocalDpi xmlns:a14="http://schemas.microsoft.com/office/drawing/2010/main" val="0"/>
+                        </a:ext>
+                      </a:extLst>
+                    </a:blip>
+                    <a:srcRect l="11947" t="3093" r="7522" b="3780"/>
+                    <a:stretch/>
+                  </pic:blipFill>
+                  <pic:spPr bwMode="auto">
+                    <a:xfrm>
+                      <a:off x="0" y="0"/>
+                      <a:ext cx="2773680" cy="8260080"/>
+                    </a:xfrm>
+                    <a:prstGeom prst="rect">
+                      <a:avLst/>
+                    </a:prstGeom>
+                    <a:noFill/>
+                    <a:ln>
+                      <a:noFill/>
+                    </a:ln>
+                    <a:extLst>
+                      <a:ext uri="{53640926-AAD7-44D8-BBD7-CCE9431645EC}">
+                        <a14:shadowObscured xmlns:a14="http://schemas.microsoft.com/office/drawing/2010/main"/>
+                      </a:ext>
+                    </a:extLst>
+                  </pic:spPr>
+                </pic:pic>
+              </a:graphicData>
+            </a:graphic>
+          </wp:anchor>
+        </w:drawing>
+      </w:r>
+      <w:r>
+        <w:rPr>
+          <w:b/>
+          <w:color w:val="000000" w:themeColor="text1"/>
+          <w:sz w:val="24"/>
+        </w:rPr>
+        <w:t xml:space="preserve">We use </w:t>
+      </w:r>
+      <w:proofErr w:type="spellStart"/>
+      <w:r>
+        <w:rPr>
+          <w:b/>
+          <w:color w:val="000000" w:themeColor="text1"/>
+          <w:sz w:val="24"/>
+        </w:rPr>
+        <w:t>GameWorld</w:t>
+      </w:r>
+      <w:proofErr w:type="spellEnd"/>
+      <w:r>
+        <w:rPr>
+          <w:b/>
+          <w:color w:val="000000" w:themeColor="text1"/>
+          <w:sz w:val="24"/>
+        </w:rPr>
+        <w:t xml:space="preserve"> </w:t>
+      </w:r>
+      <w:r>
+        <w:rPr>
+          <w:b/>
+          <w:color w:val="000000" w:themeColor="text1"/>
+          <w:sz w:val="24"/>
+        </w:rPr>
+        <w:t xml:space="preserve">to act as a central hub for our game’s world which handles player’s inventory, location, movement, player input, updating and rendering regarding game states. </w:t>
+      </w:r>
+      <w:proofErr w:type="spellStart"/>
+      <w:r>
+        <w:rPr>
+          <w:b/>
+          <w:color w:val="000000" w:themeColor="text1"/>
+          <w:sz w:val="24"/>
+        </w:rPr>
+        <w:t>GameWorld</w:t>
+      </w:r>
+      <w:proofErr w:type="spellEnd"/>
+      <w:r>
+        <w:rPr>
+          <w:b/>
+          <w:color w:val="000000" w:themeColor="text1"/>
+          <w:sz w:val="24"/>
+        </w:rPr>
+        <w:t xml:space="preserve"> is initialised by using our JSON file data where it creates and store’s locations, initialises player inventory and starting location and most importantly handles player commands.</w:t>
+      </w:r>
+    </w:p>
+    <w:p>
+      <w:pPr>
+        <w:spacing w:line="360" w:lineRule="auto"/>
+        <w:rPr>
+          <w:b/>
+          <w:noProof/>
+          <w:color w:val="767171" w:themeColor="background2" w:themeShade="80"/>
+          <w:sz w:val="28"/>
+          <w:szCs w:val="28"/>
+        </w:rPr>
+      </w:pPr>
+    </w:p>
+    <w:p>
+      <w:pPr>
+        <w:spacing w:line="360" w:lineRule="auto"/>
+        <w:rPr>
+          <w:b/>
+          <w:color w:val="767171" w:themeColor="background2" w:themeShade="80"/>
+          <w:sz w:val="28"/>
+          <w:szCs w:val="28"/>
+        </w:rPr>
+      </w:pPr>
+    </w:p>
+    <w:p>
+      <w:pPr>
+        <w:spacing w:line="360" w:lineRule="auto"/>
+        <w:rPr>
+          <w:b/>
+          <w:color w:val="767171" w:themeColor="background2" w:themeShade="80"/>
+          <w:sz w:val="28"/>
+          <w:szCs w:val="28"/>
+        </w:rPr>
+      </w:pPr>
+    </w:p>
+    <w:p>
+      <w:pPr>
+        <w:spacing w:line="360" w:lineRule="auto"/>
+        <w:jc w:val="both"/>
+      </w:pPr>
+    </w:p>
+    <w:p>
+      <w:pPr>
+        <w:spacing w:line="360" w:lineRule="auto"/>
+        <w:jc w:val="both"/>
+      </w:pPr>
+    </w:p>
+    <w:p>
+      <w:pPr>
+        <w:spacing w:line="360" w:lineRule="auto"/>
+        <w:jc w:val="both"/>
+      </w:pPr>
+    </w:p>
+    <w:p>
+      <w:pPr>
+        <w:spacing w:line="360" w:lineRule="auto"/>
+        <w:jc w:val="both"/>
+      </w:pPr>
+    </w:p>
+    <w:p>
+      <w:pPr>
+        <w:spacing w:line="360" w:lineRule="auto"/>
+        <w:jc w:val="both"/>
+      </w:pPr>
+    </w:p>
+    <w:p>
+      <w:pPr>
+        <w:spacing w:line="360" w:lineRule="auto"/>
+        <w:jc w:val="both"/>
+      </w:pPr>
+    </w:p>
+    <w:p>
+      <w:pPr>
+        <w:spacing w:line="360" w:lineRule="auto"/>
+        <w:jc w:val="both"/>
+      </w:pPr>
+    </w:p>
+    <w:p>
+      <w:pPr>
+        <w:spacing w:line="360" w:lineRule="auto"/>
+        <w:jc w:val="both"/>
+      </w:pPr>
+    </w:p>
+    <w:p>
+      <w:pPr>
+        <w:spacing w:line="360" w:lineRule="auto"/>
+        <w:jc w:val="both"/>
+      </w:pPr>
+    </w:p>
+    <w:p>
+      <w:pPr>
+        <w:spacing w:line="360" w:lineRule="auto"/>
+        <w:jc w:val="both"/>
+      </w:pPr>
+    </w:p>
+    <w:p>
+      <w:pPr>
+        <w:spacing w:line="360" w:lineRule="auto"/>
+        <w:jc w:val="both"/>
+      </w:pPr>
+    </w:p>
+    <w:p>
+      <w:pPr>
+        <w:spacing w:line="360" w:lineRule="auto"/>
+        <w:jc w:val="both"/>
+      </w:pPr>
+    </w:p>
+    <w:p>
+      <w:pPr>
+        <w:spacing w:line="360" w:lineRule="auto"/>
+        <w:jc w:val="both"/>
+      </w:pPr>
+    </w:p>
+    <w:p>
+      <w:pPr>
+        <w:spacing w:line="360" w:lineRule="auto"/>
+        <w:jc w:val="both"/>
+      </w:pPr>
+    </w:p>
+    <w:p>
+      <w:pPr>
+        <w:spacing w:line="360" w:lineRule="auto"/>
+        <w:jc w:val="both"/>
+      </w:pPr>
+    </w:p>
+    <w:p>
+      <w:pPr>
+        <w:spacing w:line="360" w:lineRule="auto"/>
+        <w:jc w:val="both"/>
+      </w:pPr>
+    </w:p>
+    <w:p>
+      <w:pPr>
+        <w:spacing w:line="360" w:lineRule="auto"/>
+        <w:jc w:val="both"/>
+      </w:pPr>
+    </w:p>
+    <w:p>
+      <w:pPr>
+        <w:spacing w:line="360" w:lineRule="auto"/>
+        <w:jc w:val="both"/>
+      </w:pPr>
+    </w:p>
+    <w:p>
+      <w:pPr>
+        <w:spacing w:line="360" w:lineRule="auto"/>
+        <w:jc w:val="both"/>
+      </w:pPr>
+    </w:p>
+    <w:p>
+      <w:pPr>
+        <w:spacing w:line="360" w:lineRule="auto"/>
+        <w:jc w:val="both"/>
+      </w:pPr>
+    </w:p>
+    <w:p>
+      <w:pPr>
+        <w:spacing w:line="360" w:lineRule="auto"/>
+        <w:jc w:val="both"/>
+      </w:pPr>
+    </w:p>
+    <w:p>
+      <w:pPr>
+        <w:spacing w:line="360" w:lineRule="auto"/>
+        <w:jc w:val="both"/>
+      </w:pPr>
+    </w:p>
+    <w:p>
+      <w:pPr>
+        <w:spacing w:line="360" w:lineRule="auto"/>
+        <w:jc w:val="both"/>
+      </w:pPr>
+    </w:p>
+    <w:p>
+      <w:pPr>
+        <w:spacing w:line="360" w:lineRule="auto"/>
+        <w:jc w:val="both"/>
+      </w:pPr>
+    </w:p>
+    <w:p>
+      <w:pPr>
+        <w:spacing w:line="360" w:lineRule="auto"/>
+        <w:jc w:val="both"/>
+      </w:pPr>
+    </w:p>
+    <w:p>
+      <w:pPr>
+        <w:spacing w:line="360" w:lineRule="auto"/>
+        <w:rPr>
+          <w:b/>
+          <w:noProof/>
+          <w:color w:val="767171" w:themeColor="background2" w:themeShade="80"/>
+          <w:sz w:val="28"/>
+          <w:szCs w:val="28"/>
+        </w:rPr>
+      </w:pPr>
+      <w:r>
+        <w:rPr>
+          <w:b/>
+          <w:noProof/>
+          <w:color w:val="767171" w:themeColor="background2" w:themeShade="80"/>
+          <w:sz w:val="28"/>
+          <w:szCs w:val="28"/>
+        </w:rPr>
+        <w:lastRenderedPageBreak/>
+        <w:drawing>
+          <wp:anchor distT="0" distB="0" distL="114300" distR="114300" simplePos="0" relativeHeight="251661312" behindDoc="0" locked="0" layoutInCell="1" allowOverlap="1" wp14:anchorId="695ADD98" wp14:editId="0E29F5AA">
+            <wp:simplePos x="0" y="0"/>
+            <wp:positionH relativeFrom="margin">
+              <wp:align>center</wp:align>
+            </wp:positionH>
+            <wp:positionV relativeFrom="paragraph">
+              <wp:posOffset>396240</wp:posOffset>
+            </wp:positionV>
+            <wp:extent cx="3855720" cy="2581910"/>
+            <wp:effectExtent l="0" t="0" r="0" b="8890"/>
+            <wp:wrapTopAndBottom/>
+            <wp:docPr id="969181552" name="Picture 3"/>
+            <wp:cNvGraphicFramePr>
+              <a:graphicFrameLocks xmlns:a="http://schemas.openxmlformats.org/drawingml/2006/main" noChangeAspect="1"/>
+            </wp:cNvGraphicFramePr>
+            <a:graphic xmlns:a="http://schemas.openxmlformats.org/drawingml/2006/main">
+              <a:graphicData uri="http://schemas.openxmlformats.org/drawingml/2006/picture">
+                <pic:pic xmlns:pic="http://schemas.openxmlformats.org/drawingml/2006/picture">
+                  <pic:nvPicPr>
+                    <pic:cNvPr id="0" name="Picture 3"/>
+                    <pic:cNvPicPr>
+                      <a:picLocks noChangeAspect="1" noChangeArrowheads="1"/>
+                    </pic:cNvPicPr>
+                  </pic:nvPicPr>
+                  <pic:blipFill rotWithShape="1">
+                    <a:blip r:embed="rId10">
+                      <a:extLst>
+                        <a:ext uri="{28A0092B-C50C-407E-A947-70E740481C1C}">
+                          <a14:useLocalDpi xmlns:a14="http://schemas.microsoft.com/office/drawing/2010/main" val="0"/>
+                        </a:ext>
+                      </a:extLst>
+                    </a:blip>
+                    <a:srcRect l="8479" t="11724" r="9228" b="12070"/>
+                    <a:stretch/>
+                  </pic:blipFill>
+                  <pic:spPr bwMode="auto">
+                    <a:xfrm>
+                      <a:off x="0" y="0"/>
+                      <a:ext cx="3855720" cy="2581910"/>
+                    </a:xfrm>
+                    <a:prstGeom prst="rect">
+                      <a:avLst/>
+                    </a:prstGeom>
+                    <a:noFill/>
+                    <a:ln>
+                      <a:noFill/>
+                    </a:ln>
+                    <a:extLst>
+                      <a:ext uri="{53640926-AAD7-44D8-BBD7-CCE9431645EC}">
+                        <a14:shadowObscured xmlns:a14="http://schemas.microsoft.com/office/drawing/2010/main"/>
+                      </a:ext>
+                    </a:extLst>
+                  </pic:spPr>
+                </pic:pic>
+              </a:graphicData>
+            </a:graphic>
+            <wp14:sizeRelH relativeFrom="margin">
+              <wp14:pctWidth>0</wp14:pctWidth>
+            </wp14:sizeRelH>
+            <wp14:sizeRelV relativeFrom="margin">
+              <wp14:pctHeight>0</wp14:pctHeight>
+            </wp14:sizeRelV>
+          </wp:anchor>
+        </w:drawing>
+      </w:r>
+      <w:r>
+        <w:rPr>
+          <w:b/>
+          <w:color w:val="767171" w:themeColor="background2" w:themeShade="80"/>
+          <w:sz w:val="28"/>
+          <w:szCs w:val="28"/>
+        </w:rPr>
+        <w:t xml:space="preserve">Implementing </w:t>
+      </w:r>
+      <w:r>
+        <w:rPr>
+          <w:b/>
+          <w:color w:val="767171" w:themeColor="background2" w:themeShade="80"/>
+          <w:sz w:val="28"/>
+          <w:szCs w:val="28"/>
+        </w:rPr>
+        <w:t>Command Processing</w:t>
+      </w:r>
+    </w:p>
+    <w:p>
+      <w:pPr>
+        <w:spacing w:line="360" w:lineRule="auto"/>
+        <w:rPr>
+          <w:b/>
+          <w:noProof/>
+          <w:color w:val="767171" w:themeColor="background2" w:themeShade="80"/>
+          <w:sz w:val="28"/>
+          <w:szCs w:val="28"/>
+        </w:rPr>
+      </w:pPr>
+      <w:r>
+        <w:rPr>
+          <w:b/>
+          <w:noProof/>
+          <w:color w:val="767171" w:themeColor="background2" w:themeShade="80"/>
+          <w:sz w:val="28"/>
+          <w:szCs w:val="28"/>
+        </w:rPr>
+        <w:drawing>
+          <wp:anchor distT="0" distB="0" distL="114300" distR="114300" simplePos="0" relativeHeight="251660288" behindDoc="0" locked="0" layoutInCell="1" allowOverlap="1" wp14:anchorId="4FD58612" wp14:editId="70F8F8E5">
+            <wp:simplePos x="0" y="0"/>
+            <wp:positionH relativeFrom="column">
+              <wp:posOffset>-201930</wp:posOffset>
+            </wp:positionH>
+            <wp:positionV relativeFrom="paragraph">
+              <wp:posOffset>2695575</wp:posOffset>
+            </wp:positionV>
+            <wp:extent cx="3108960" cy="5244465"/>
+            <wp:effectExtent l="0" t="0" r="0" b="0"/>
+            <wp:wrapThrough wrapText="bothSides">
+              <wp:wrapPolygon edited="0">
+                <wp:start x="0" y="0"/>
+                <wp:lineTo x="0" y="21498"/>
+                <wp:lineTo x="21441" y="21498"/>
+                <wp:lineTo x="21441" y="0"/>
+                <wp:lineTo x="0" y="0"/>
+              </wp:wrapPolygon>
+            </wp:wrapThrough>
+            <wp:docPr id="21373589" name="Picture 4"/>
+            <wp:cNvGraphicFramePr>
+              <a:graphicFrameLocks xmlns:a="http://schemas.openxmlformats.org/drawingml/2006/main" noChangeAspect="1"/>
+            </wp:cNvGraphicFramePr>
+            <a:graphic xmlns:a="http://schemas.openxmlformats.org/drawingml/2006/main">
+              <a:graphicData uri="http://schemas.openxmlformats.org/drawingml/2006/picture">
+                <pic:pic xmlns:pic="http://schemas.openxmlformats.org/drawingml/2006/picture">
+                  <pic:nvPicPr>
+                    <pic:cNvPr id="0" name="Picture 4"/>
+                    <pic:cNvPicPr>
+                      <a:picLocks noChangeAspect="1" noChangeArrowheads="1"/>
+                    </pic:cNvPicPr>
+                  </pic:nvPicPr>
+                  <pic:blipFill rotWithShape="1">
+                    <a:blip r:embed="rId11">
+                      <a:extLst>
+                        <a:ext uri="{28A0092B-C50C-407E-A947-70E740481C1C}">
+                          <a14:useLocalDpi xmlns:a14="http://schemas.microsoft.com/office/drawing/2010/main" val="0"/>
+                        </a:ext>
+                      </a:extLst>
+                    </a:blip>
+                    <a:srcRect l="7692" t="5154" r="7143" b="4983"/>
+                    <a:stretch/>
+                  </pic:blipFill>
+                  <pic:spPr bwMode="auto">
+                    <a:xfrm>
+                      <a:off x="0" y="0"/>
+                      <a:ext cx="3108960" cy="5244465"/>
+                    </a:xfrm>
+                    <a:prstGeom prst="rect">
+                      <a:avLst/>
+                    </a:prstGeom>
+                    <a:noFill/>
+                    <a:ln>
+                      <a:noFill/>
+                    </a:ln>
+                    <a:extLst>
+                      <a:ext uri="{53640926-AAD7-44D8-BBD7-CCE9431645EC}">
+                        <a14:shadowObscured xmlns:a14="http://schemas.microsoft.com/office/drawing/2010/main"/>
+                      </a:ext>
+                    </a:extLst>
+                  </pic:spPr>
+                </pic:pic>
+              </a:graphicData>
+            </a:graphic>
+            <wp14:sizeRelH relativeFrom="margin">
+              <wp14:pctWidth>0</wp14:pctWidth>
+            </wp14:sizeRelH>
+            <wp14:sizeRelV relativeFrom="margin">
+              <wp14:pctHeight>0</wp14:pctHeight>
+            </wp14:sizeRelV>
+          </wp:anchor>
+        </w:drawing>
+      </w:r>
+      <w:r>
+        <w:rPr>
+          <w:b/>
+          <w:color w:val="767171" w:themeColor="background2" w:themeShade="80"/>
+          <w:sz w:val="28"/>
+          <w:szCs w:val="28"/>
+        </w:rPr>
+        <w:t>:</w:t>
+      </w:r>
+    </w:p>
+    <w:p>
+      <w:pPr>
+        <w:spacing w:line="360" w:lineRule="auto"/>
+        <w:jc w:val="both"/>
+        <w:rPr>
+          <w:b/>
+          <w:noProof/>
+          <w:color w:val="000000" w:themeColor="text1"/>
+          <w:sz w:val="24"/>
+        </w:rPr>
+      </w:pPr>
+      <w:r>
+        <w:rPr>
+          <w:b/>
+          <w:noProof/>
+          <w:color w:val="000000" w:themeColor="text1"/>
+          <w:sz w:val="24"/>
+        </w:rPr>
+        <w:t>Using a Command base class and Command Mnaager we empass commands to invoke them when a user input for a command has been received. In the processCommand constructor we use a set list of commands to be created and some commands need the use of pointers to reference it. Therefore, processing commands require inputting of a vector string to check against the commands dictionary and then execute it. We also store commandmanager in the GameWorld so that its called once per update.</w:t>
+      </w:r>
+    </w:p>
+    <w:p>
+      <w:pPr>
+        <w:spacing w:line="360" w:lineRule="auto"/>
+        <w:rPr>
+          <w:b/>
+          <w:noProof/>
+          <w:color w:val="767171" w:themeColor="background2" w:themeShade="80"/>
+          <w:sz w:val="28"/>
+          <w:szCs w:val="28"/>
+        </w:rPr>
+      </w:pPr>
+      <w:r>
+        <w:rPr>
+          <w:b/>
+          <w:noProof/>
+          <w:color w:val="767171" w:themeColor="background2" w:themeShade="80"/>
+          <w:sz w:val="28"/>
+          <w:szCs w:val="28"/>
+        </w:rPr>
+        <w:lastRenderedPageBreak/>
+        <w:drawing>
+          <wp:anchor distT="0" distB="0" distL="114300" distR="114300" simplePos="0" relativeHeight="251662336" behindDoc="0" locked="0" layoutInCell="1" allowOverlap="1" wp14:anchorId="65C7288E" wp14:editId="3A5F34D7">
+            <wp:simplePos x="0" y="0"/>
+            <wp:positionH relativeFrom="margin">
+              <wp:align>center</wp:align>
+            </wp:positionH>
+            <wp:positionV relativeFrom="paragraph">
+              <wp:posOffset>152400</wp:posOffset>
+            </wp:positionV>
+            <wp:extent cx="4373880" cy="3274301"/>
+            <wp:effectExtent l="0" t="0" r="7620" b="2540"/>
+            <wp:wrapTopAndBottom/>
+            <wp:docPr id="659356840" name="Picture 5"/>
+            <wp:cNvGraphicFramePr>
+              <a:graphicFrameLocks xmlns:a="http://schemas.openxmlformats.org/drawingml/2006/main" noChangeAspect="1"/>
+            </wp:cNvGraphicFramePr>
+            <a:graphic xmlns:a="http://schemas.openxmlformats.org/drawingml/2006/main">
+              <a:graphicData uri="http://schemas.openxmlformats.org/drawingml/2006/picture">
+                <pic:pic xmlns:pic="http://schemas.openxmlformats.org/drawingml/2006/picture">
+                  <pic:nvPicPr>
+                    <pic:cNvPr id="0" name="Picture 5"/>
+                    <pic:cNvPicPr>
+                      <a:picLocks noChangeAspect="1" noChangeArrowheads="1"/>
+                    </pic:cNvPicPr>
+                  </pic:nvPicPr>
+                  <pic:blipFill rotWithShape="1">
+                    <a:blip r:embed="rId12">
+                      <a:extLst>
+                        <a:ext uri="{28A0092B-C50C-407E-A947-70E740481C1C}">
+                          <a14:useLocalDpi xmlns:a14="http://schemas.microsoft.com/office/drawing/2010/main" val="0"/>
+                        </a:ext>
+                      </a:extLst>
+                    </a:blip>
+                    <a:srcRect l="5985" t="6070" r="4738" b="8306"/>
+                    <a:stretch/>
+                  </pic:blipFill>
+                  <pic:spPr bwMode="auto">
+                    <a:xfrm>
+                      <a:off x="0" y="0"/>
+                      <a:ext cx="4373880" cy="3274301"/>
+                    </a:xfrm>
+                    <a:prstGeom prst="rect">
+                      <a:avLst/>
+                    </a:prstGeom>
+                    <a:noFill/>
+                    <a:ln>
+                      <a:noFill/>
+                    </a:ln>
+                    <a:extLst>
+                      <a:ext uri="{53640926-AAD7-44D8-BBD7-CCE9431645EC}">
+                        <a14:shadowObscured xmlns:a14="http://schemas.microsoft.com/office/drawing/2010/main"/>
+                      </a:ext>
+                    </a:extLst>
+                  </pic:spPr>
+                </pic:pic>
+              </a:graphicData>
+            </a:graphic>
+          </wp:anchor>
+        </w:drawing>
+      </w:r>
+    </w:p>
+    <w:p>
+      <w:pPr>
+        <w:spacing w:line="360" w:lineRule="auto"/>
+        <w:jc w:val="both"/>
+        <w:rPr>
+          <w:b/>
+          <w:color w:val="000000" w:themeColor="text1"/>
+          <w:sz w:val="24"/>
+        </w:rPr>
+      </w:pPr>
+      <w:r>
+        <w:rPr>
+          <w:b/>
+          <w:noProof/>
+          <w:color w:val="767171" w:themeColor="background2" w:themeShade="80"/>
+          <w:sz w:val="28"/>
+          <w:szCs w:val="28"/>
+        </w:rPr>
+        <w:drawing>
+          <wp:anchor distT="0" distB="0" distL="114300" distR="114300" simplePos="0" relativeHeight="251663360" behindDoc="0" locked="0" layoutInCell="1" allowOverlap="1" wp14:anchorId="19CB9D1E" wp14:editId="5C078501">
+            <wp:simplePos x="0" y="0"/>
+            <wp:positionH relativeFrom="margin">
+              <wp:align>center</wp:align>
+            </wp:positionH>
+            <wp:positionV relativeFrom="paragraph">
+              <wp:posOffset>1047750</wp:posOffset>
+            </wp:positionV>
+            <wp:extent cx="4434840" cy="2781388"/>
+            <wp:effectExtent l="0" t="0" r="3810" b="0"/>
+            <wp:wrapTopAndBottom/>
+            <wp:docPr id="144821373" name="Picture 6"/>
+            <wp:cNvGraphicFramePr>
+              <a:graphicFrameLocks xmlns:a="http://schemas.openxmlformats.org/drawingml/2006/main" noChangeAspect="1"/>
+            </wp:cNvGraphicFramePr>
+            <a:graphic xmlns:a="http://schemas.openxmlformats.org/drawingml/2006/main">
+              <a:graphicData uri="http://schemas.openxmlformats.org/drawingml/2006/picture">
+                <pic:pic xmlns:pic="http://schemas.openxmlformats.org/drawingml/2006/picture">
+                  <pic:nvPicPr>
+                    <pic:cNvPr id="0" name="Picture 6"/>
+                    <pic:cNvPicPr>
+                      <a:picLocks noChangeAspect="1" noChangeArrowheads="1"/>
+                    </pic:cNvPicPr>
+                  </pic:nvPicPr>
+                  <pic:blipFill rotWithShape="1">
+                    <a:blip r:embed="rId13">
+                      <a:extLst>
+                        <a:ext uri="{28A0092B-C50C-407E-A947-70E740481C1C}">
+                          <a14:useLocalDpi xmlns:a14="http://schemas.microsoft.com/office/drawing/2010/main" val="0"/>
+                        </a:ext>
+                      </a:extLst>
+                    </a:blip>
+                    <a:srcRect l="7232" t="9782" r="6483" b="11594"/>
+                    <a:stretch/>
+                  </pic:blipFill>
+                  <pic:spPr bwMode="auto">
+                    <a:xfrm>
+                      <a:off x="0" y="0"/>
+                      <a:ext cx="4434840" cy="2781388"/>
+                    </a:xfrm>
+                    <a:prstGeom prst="rect">
+                      <a:avLst/>
+                    </a:prstGeom>
+                    <a:noFill/>
+                    <a:ln>
+                      <a:noFill/>
+                    </a:ln>
+                    <a:extLst>
+                      <a:ext uri="{53640926-AAD7-44D8-BBD7-CCE9431645EC}">
+                        <a14:shadowObscured xmlns:a14="http://schemas.microsoft.com/office/drawing/2010/main"/>
+                      </a:ext>
+                    </a:extLst>
+                  </pic:spPr>
+                </pic:pic>
+              </a:graphicData>
+            </a:graphic>
+          </wp:anchor>
+        </w:drawing>
+      </w:r>
+      <w:r>
+        <w:rPr>
+          <w:b/>
+          <w:color w:val="000000" w:themeColor="text1"/>
+          <w:sz w:val="24"/>
+        </w:rPr>
+        <w:t>Using command class, we were able to create the command such as Go, Look, Alias, Debug, and Inventory commands. For example, Go Command is used to check if player can move to one of the locations connections / directions from their current location.</w:t>
+      </w:r>
+    </w:p>
+    <w:p>
+      <w:pPr>
+        <w:spacing w:line="360" w:lineRule="auto"/>
+        <w:jc w:val="both"/>
+        <w:rPr>
+          <w:b/>
+          <w:color w:val="000000" w:themeColor="text1"/>
+          <w:sz w:val="24"/>
+        </w:rPr>
+      </w:pPr>
+    </w:p>
+    <w:p>
+      <w:pPr>
+        <w:spacing w:line="360" w:lineRule="auto"/>
+        <w:jc w:val="both"/>
+        <w:rPr>
+          <w:b/>
+          <w:color w:val="000000" w:themeColor="text1"/>
+          <w:sz w:val="24"/>
+        </w:rPr>
+      </w:pPr>
+      <w:r>
+        <w:rPr>
+          <w:b/>
+          <w:color w:val="000000" w:themeColor="text1"/>
+          <w:sz w:val="24"/>
+        </w:rPr>
+        <w:t xml:space="preserve">Whereas Debug command which is </w:t>
+      </w:r>
+      <w:proofErr w:type="spellStart"/>
+      <w:r>
+        <w:rPr>
+          <w:b/>
+          <w:color w:val="000000" w:themeColor="text1"/>
+          <w:sz w:val="24"/>
+        </w:rPr>
+        <w:t>abit</w:t>
+      </w:r>
+      <w:proofErr w:type="spellEnd"/>
+      <w:r>
+        <w:rPr>
+          <w:b/>
+          <w:color w:val="000000" w:themeColor="text1"/>
+          <w:sz w:val="24"/>
+        </w:rPr>
+        <w:t xml:space="preserve"> more complex outputs player information with the use of Player.cpp to get player’s inventory and current location. </w:t>
+      </w:r>
+      <w:proofErr w:type="gramStart"/>
+      <w:r>
+        <w:rPr>
+          <w:b/>
+          <w:color w:val="000000" w:themeColor="text1"/>
+          <w:sz w:val="24"/>
+        </w:rPr>
+        <w:t>Basically</w:t>
+      </w:r>
+      <w:proofErr w:type="gramEnd"/>
+      <w:r>
+        <w:rPr>
+          <w:b/>
+          <w:color w:val="000000" w:themeColor="text1"/>
+          <w:sz w:val="24"/>
+        </w:rPr>
+        <w:t xml:space="preserve"> used to show useful debugging information regarding our game graph world and its entities.</w:t>
+      </w:r>
     </w:p>
     <w:sectPr>
-      <w:headerReference w:type="default" r:id="rId8"/>
+      <w:headerReference w:type="default" r:id="rId14"/>
       <w:pgSz w:w="11900" w:h="16840"/>
       <w:pgMar w:top="1440" w:right="1134" w:bottom="1440" w:left="1134" w:header="709" w:footer="709" w:gutter="0"/>
       <w:cols w:space="708"/>

</xml_diff>

<commit_message>
created images and code
</commit_message>
<xml_diff>
--- a/12 - Spike - Command Pattern/Task 12 - Lab Spike Report.docx
+++ b/12 - Spike - Command Pattern/Task 12 - Lab Spike Report.docx
@@ -28,7 +28,13 @@
         <w:rPr>
           <w:rStyle w:val="SubtleReference"/>
         </w:rPr>
-        <w:t>12</w:t>
+        <w:t>1</w:t>
+      </w:r>
+      <w:r>
+        <w:rPr>
+          <w:rStyle w:val="SubtleReference"/>
+        </w:rPr>
+        <w:t>7</w:t>
       </w:r>
       <w:r>
         <w:rPr>
@@ -61,7 +67,7 @@
           <w:sz w:val="28"/>
           <w:szCs w:val="28"/>
         </w:rPr>
-        <w:t>Command Pattern</w:t>
+        <w:t>Sprites and Graphics</w:t>
       </w:r>
     </w:p>
     <w:p>
@@ -148,25 +154,15 @@
           <w:sz w:val="24"/>
           <w:szCs w:val="24"/>
         </w:rPr>
-        <w:t xml:space="preserve">how I extended task 8 code of </w:t>
-      </w:r>
-      <w:proofErr w:type="spellStart"/>
-      <w:r>
-        <w:rPr>
-          <w:rStyle w:val="SubtleReference"/>
-          <w:sz w:val="24"/>
-          <w:szCs w:val="24"/>
-        </w:rPr>
-        <w:t>Zorkish</w:t>
-      </w:r>
-      <w:proofErr w:type="spellEnd"/>
-      <w:r>
-        <w:rPr>
-          <w:rStyle w:val="SubtleReference"/>
-          <w:sz w:val="24"/>
-          <w:szCs w:val="24"/>
-        </w:rPr>
-        <w:t xml:space="preserve"> Adventure to read from file for game word and process commands.</w:t>
+        <w:t xml:space="preserve">how I </w:t>
+      </w:r>
+      <w:r>
+        <w:rPr>
+          <w:rStyle w:val="SubtleReference"/>
+          <w:sz w:val="24"/>
+          <w:szCs w:val="24"/>
+        </w:rPr>
+        <w:t>load 2d images from file and display them on the screen using SDL2.</w:t>
       </w:r>
     </w:p>
     <w:p>
@@ -321,36 +317,8 @@
           <w:sz w:val="24"/>
           <w:szCs w:val="24"/>
         </w:rPr>
-        <w:t>\</w:t>
-      </w:r>
-      <w:proofErr w:type="spellStart"/>
-      <w:r>
-        <w:rPr>
-          <w:rStyle w:val="SubtleReference"/>
-          <w:sz w:val="24"/>
-          <w:szCs w:val="24"/>
-        </w:rPr>
-        <w:t>Zorkish</w:t>
-      </w:r>
-      <w:proofErr w:type="spellEnd"/>
-      <w:r>
-        <w:rPr>
-          <w:rStyle w:val="SubtleReference"/>
-          <w:sz w:val="24"/>
-          <w:szCs w:val="24"/>
-        </w:rPr>
-        <w:t>\</w:t>
-      </w:r>
-      <w:proofErr w:type="spellStart"/>
-      <w:r>
-        <w:rPr>
-          <w:rStyle w:val="SubtleReference"/>
-          <w:sz w:val="24"/>
-          <w:szCs w:val="24"/>
-        </w:rPr>
-        <w:t>Zorkish</w:t>
-      </w:r>
-      <w:proofErr w:type="spellEnd"/>
+        <w:t>\Zorkish\Zorkish</w:t>
+      </w:r>
     </w:p>
     <w:p>
       <w:pPr>
@@ -625,25 +593,7 @@
           <w:sz w:val="24"/>
           <w:szCs w:val="24"/>
         </w:rPr>
-        <w:t xml:space="preserve">Use Task 8 </w:t>
-      </w:r>
-      <w:proofErr w:type="spellStart"/>
-      <w:r>
-        <w:rPr>
-          <w:rStyle w:val="SubtleReference"/>
-          <w:sz w:val="24"/>
-          <w:szCs w:val="24"/>
-        </w:rPr>
-        <w:t>Zorkish</w:t>
-      </w:r>
-      <w:proofErr w:type="spellEnd"/>
-      <w:r>
-        <w:rPr>
-          <w:rStyle w:val="SubtleReference"/>
-          <w:sz w:val="24"/>
-          <w:szCs w:val="24"/>
-        </w:rPr>
-        <w:t xml:space="preserve"> Code</w:t>
+        <w:t>Use Task 8 Zorkish Code</w:t>
       </w:r>
     </w:p>
     <w:p>
@@ -825,14 +775,27 @@
       <w:r>
         <w:t xml:space="preserve">Figure </w:t>
       </w:r>
-      <w:fldSimple w:instr=" SEQ Figure \* ARABIC ">
-        <w:r>
-          <w:rPr>
-            <w:noProof/>
-          </w:rPr>
-          <w:t>1</w:t>
-        </w:r>
-      </w:fldSimple>
+      <w:r>
+        <w:fldChar w:fldCharType="begin"/>
+      </w:r>
+      <w:r>
+        <w:instrText xml:space="preserve"> SEQ Figure \* ARABIC </w:instrText>
+      </w:r>
+      <w:r>
+        <w:fldChar w:fldCharType="separate"/>
+      </w:r>
+      <w:r>
+        <w:rPr>
+          <w:noProof/>
+        </w:rPr>
+        <w:t>1</w:t>
+      </w:r>
+      <w:r>
+        <w:rPr>
+          <w:noProof/>
+        </w:rPr>
+        <w:fldChar w:fldCharType="end"/>
+      </w:r>
       <w:r>
         <w:t xml:space="preserve"> : </w:t>
       </w:r>
@@ -846,15 +809,7 @@
         <w:t>2</w:t>
       </w:r>
       <w:r>
-        <w:t xml:space="preserve"> of </w:t>
-      </w:r>
-      <w:proofErr w:type="spellStart"/>
-      <w:r>
-        <w:t>Zorkish</w:t>
-      </w:r>
-      <w:proofErr w:type="spellEnd"/>
-      <w:r>
-        <w:t xml:space="preserve"> Adventure Game</w:t>
+        <w:t xml:space="preserve"> of Zorkish Adventure Game</w:t>
       </w:r>
     </w:p>
     <w:p/>
@@ -950,19 +905,8 @@
           <w:sz w:val="28"/>
           <w:szCs w:val="28"/>
         </w:rPr>
-        <w:t xml:space="preserve">Implementing </w:t>
-      </w:r>
-      <w:proofErr w:type="spellStart"/>
-      <w:r>
-        <w:rPr>
-          <w:b/>
-          <w:color w:val="767171" w:themeColor="background2" w:themeShade="80"/>
-          <w:sz w:val="28"/>
-          <w:szCs w:val="28"/>
-        </w:rPr>
-        <w:t>GameWorld</w:t>
-      </w:r>
-      <w:proofErr w:type="spellEnd"/>
+        <w:t>Implementing GameWorld</w:t>
+      </w:r>
       <w:r>
         <w:rPr>
           <w:b/>
@@ -1103,7 +1047,6 @@
         </w:rPr>
         <w:t xml:space="preserve">We use </w:t>
       </w:r>
-      <w:proofErr w:type="spellStart"/>
       <w:r>
         <w:rPr>
           <w:b/>
@@ -1112,7 +1055,6 @@
         </w:rPr>
         <w:t>GameWorld</w:t>
       </w:r>
-      <w:proofErr w:type="spellEnd"/>
       <w:r>
         <w:rPr>
           <w:b/>
@@ -1127,25 +1069,7 @@
           <w:color w:val="000000" w:themeColor="text1"/>
           <w:sz w:val="24"/>
         </w:rPr>
-        <w:t xml:space="preserve">to act as a central hub for our game’s world which handles player’s inventory, location, movement, player input, updating and rendering regarding game states. </w:t>
-      </w:r>
-      <w:proofErr w:type="spellStart"/>
-      <w:r>
-        <w:rPr>
-          <w:b/>
-          <w:color w:val="000000" w:themeColor="text1"/>
-          <w:sz w:val="24"/>
-        </w:rPr>
-        <w:t>GameWorld</w:t>
-      </w:r>
-      <w:proofErr w:type="spellEnd"/>
-      <w:r>
-        <w:rPr>
-          <w:b/>
-          <w:color w:val="000000" w:themeColor="text1"/>
-          <w:sz w:val="24"/>
-        </w:rPr>
-        <w:t xml:space="preserve"> is initialised by using our JSON file data where it creates and store’s locations, initialises player inventory and starting location and most importantly handles player commands.</w:t>
+        <w:t>to act as a central hub for our game’s world which handles player’s inventory, location, movement, player input, updating and rendering regarding game states. GameWorld is initialised by using our JSON file data where it creates and store’s locations, initialises player inventory and starting location and most importantly handles player commands.</w:t>
       </w:r>
     </w:p>
     <w:p>
@@ -1747,43 +1671,7 @@
           <w:color w:val="000000" w:themeColor="text1"/>
           <w:sz w:val="24"/>
         </w:rPr>
-        <w:t xml:space="preserve">Whereas Debug command which is </w:t>
-      </w:r>
-      <w:proofErr w:type="spellStart"/>
-      <w:r>
-        <w:rPr>
-          <w:b/>
-          <w:color w:val="000000" w:themeColor="text1"/>
-          <w:sz w:val="24"/>
-        </w:rPr>
-        <w:t>abit</w:t>
-      </w:r>
-      <w:proofErr w:type="spellEnd"/>
-      <w:r>
-        <w:rPr>
-          <w:b/>
-          <w:color w:val="000000" w:themeColor="text1"/>
-          <w:sz w:val="24"/>
-        </w:rPr>
-        <w:t xml:space="preserve"> more complex outputs player information with the use of Player.cpp to get player’s inventory and current location. </w:t>
-      </w:r>
-      <w:proofErr w:type="gramStart"/>
-      <w:r>
-        <w:rPr>
-          <w:b/>
-          <w:color w:val="000000" w:themeColor="text1"/>
-          <w:sz w:val="24"/>
-        </w:rPr>
-        <w:t>Basically</w:t>
-      </w:r>
-      <w:proofErr w:type="gramEnd"/>
-      <w:r>
-        <w:rPr>
-          <w:b/>
-          <w:color w:val="000000" w:themeColor="text1"/>
-          <w:sz w:val="24"/>
-        </w:rPr>
-        <w:t xml:space="preserve"> used to show useful debugging information regarding our game graph world and its entities.</w:t>
+        <w:t>Whereas Debug command which is abit more complex outputs player information with the use of Player.cpp to get player’s inventory and current location. Basically used to show useful debugging information regarding our game graph world and its entities.</w:t>
       </w:r>
     </w:p>
     <w:sectPr>
@@ -2689,7 +2577,6 @@
   <w:style w:type="character" w:default="1" w:styleId="DefaultParagraphFont">
     <w:name w:val="Default Paragraph Font"/>
     <w:uiPriority w:val="1"/>
-    <w:semiHidden/>
     <w:unhideWhenUsed/>
   </w:style>
   <w:style w:type="table" w:default="1" w:styleId="TableNormal">

</xml_diff>